<commit_message>
Fix KP Word: show per-stage pricing in main body.
Restore cost and 50/50 payment on each stage plus summary table before GRC infrastructure section.

Co-authored-by: Cursor <cursoragent@cursor.com>
</commit_message>
<xml_diff>
--- a/GRC → US — коммерческое предложение.docx
+++ b/GRC → US — коммерческое предложение.docx
@@ -93,20 +93,6 @@
           <w:sz w:val="22"/>
         </w:rPr>
         <w:t>Формат: поэтапное внедрение · согласование и приёмка по этапам · сервисы — на аккаунтах GRC.</w:t>
-      </w:r>
-    </w:p>
-    <w:p>
-      <w:pPr>
-        <w:spacing w:after="240"/>
-      </w:pPr>
-      <w:r>
-        <w:rPr>
-          <w:rFonts w:ascii="Calibri" w:hAnsi="Calibri"/>
-          <w:b w:val="0"/>
-          <w:color w:val="334155"/>
-          <w:sz w:val="20"/>
-        </w:rPr>
-        <w:t>Стоимость работ и схема оплаты — в приложении в конце документа, после описания этапов.</w:t>
       </w:r>
     </w:p>
     <w:p/>
@@ -753,7 +739,7 @@
           <w:rFonts w:ascii="Calibri" w:hAnsi="Calibri"/>
           <w:color w:val="0F172A"/>
         </w:rPr>
-        <w:t>3. Этапы внедрения</w:t>
+        <w:t>3. Этапы внедрения и стоимость работ</w:t>
       </w:r>
     </w:p>
     <w:p>
@@ -767,9 +753,508 @@
           <w:color w:val="334155"/>
           <w:sz w:val="20"/>
         </w:rPr>
-        <w:t>Четыре этапа с понятной сдачей. Сроки — в неделях. Календарь зависит от согласований и доступов GRC.</w:t>
+        <w:t>Четыре этапа · сроки в неделях · оплата 50% на старт и 50% после приёмки каждого этапа. Ориентир программы: ~6 месяцев; полный контур — до 8 месяцев.</w:t>
       </w:r>
     </w:p>
+    <w:p>
+      <w:pPr>
+        <w:pStyle w:val="Heading3"/>
+      </w:pPr>
+      <w:r>
+        <w:rPr>
+          <w:rFonts w:ascii="Calibri" w:hAnsi="Calibri"/>
+          <w:color w:val="B45309"/>
+        </w:rPr>
+        <w:t>Сводка: сколько платит GRC за работы исполнителя</w:t>
+      </w:r>
+    </w:p>
+    <w:tbl>
+      <w:tblPr>
+        <w:tblStyle w:val="TableGrid"/>
+        <w:tblW w:type="auto" w:w="0"/>
+        <w:jc w:val="center"/>
+        <w:tblLook w:firstColumn="1" w:firstRow="1" w:lastColumn="0" w:lastRow="0" w:noHBand="0" w:noVBand="1" w:val="04A0"/>
+      </w:tblPr>
+      <w:tblGrid>
+        <w:gridCol w:w="1930"/>
+        <w:gridCol w:w="1930"/>
+        <w:gridCol w:w="1930"/>
+        <w:gridCol w:w="1930"/>
+        <w:gridCol w:w="1930"/>
+      </w:tblGrid>
+      <w:tr>
+        <w:tc>
+          <w:tcPr>
+            <w:tcW w:type="dxa" w:w="1584"/>
+            <w:shd w:fill="0F172A" w:val="clear"/>
+          </w:tcPr>
+          <w:p>
+            <w:r>
+              <w:rPr>
+                <w:rFonts w:ascii="Calibri" w:hAnsi="Calibri"/>
+                <w:b/>
+                <w:color w:val="FFFFFF"/>
+                <w:sz w:val="20"/>
+              </w:rPr>
+              <w:t>Этап</w:t>
+            </w:r>
+          </w:p>
+        </w:tc>
+        <w:tc>
+          <w:tcPr>
+            <w:tcW w:type="dxa" w:w="1080"/>
+            <w:shd w:fill="0F172A" w:val="clear"/>
+          </w:tcPr>
+          <w:p>
+            <w:r>
+              <w:rPr>
+                <w:rFonts w:ascii="Calibri" w:hAnsi="Calibri"/>
+                <w:b/>
+                <w:color w:val="FFFFFF"/>
+                <w:sz w:val="20"/>
+              </w:rPr>
+              <w:t>Срок</w:t>
+            </w:r>
+          </w:p>
+        </w:tc>
+        <w:tc>
+          <w:tcPr>
+            <w:tcW w:type="dxa" w:w="1224"/>
+            <w:shd w:fill="0F172A" w:val="clear"/>
+          </w:tcPr>
+          <w:p>
+            <w:r>
+              <w:rPr>
+                <w:rFonts w:ascii="Calibri" w:hAnsi="Calibri"/>
+                <w:b/>
+                <w:color w:val="FFFFFF"/>
+                <w:sz w:val="20"/>
+              </w:rPr>
+              <w:t>Стоимость</w:t>
+            </w:r>
+          </w:p>
+        </w:tc>
+        <w:tc>
+          <w:tcPr>
+            <w:tcW w:type="dxa" w:w="1224"/>
+            <w:shd w:fill="0F172A" w:val="clear"/>
+          </w:tcPr>
+          <w:p>
+            <w:r>
+              <w:rPr>
+                <w:rFonts w:ascii="Calibri" w:hAnsi="Calibri"/>
+                <w:b/>
+                <w:color w:val="FFFFFF"/>
+                <w:sz w:val="20"/>
+              </w:rPr>
+              <w:t>Старт (50%)</w:t>
+            </w:r>
+          </w:p>
+        </w:tc>
+        <w:tc>
+          <w:tcPr>
+            <w:tcW w:type="dxa" w:w="1368"/>
+            <w:shd w:fill="0F172A" w:val="clear"/>
+          </w:tcPr>
+          <w:p>
+            <w:r>
+              <w:rPr>
+                <w:rFonts w:ascii="Calibri" w:hAnsi="Calibri"/>
+                <w:b/>
+                <w:color w:val="FFFFFF"/>
+                <w:sz w:val="20"/>
+              </w:rPr>
+              <w:t>После приёмки (50%)</w:t>
+            </w:r>
+          </w:p>
+        </w:tc>
+      </w:tr>
+      <w:tr>
+        <w:tc>
+          <w:tcPr>
+            <w:tcW w:type="dxa" w:w="1584"/>
+            <w:shd w:fill="FFFFFF" w:val="clear"/>
+          </w:tcPr>
+          <w:p>
+            <w:r>
+              <w:rPr>
+                <w:rFonts w:ascii="Calibri" w:hAnsi="Calibri"/>
+                <w:sz w:val="20"/>
+              </w:rPr>
+              <w:t>1 · Фундамент</w:t>
+            </w:r>
+          </w:p>
+        </w:tc>
+        <w:tc>
+          <w:tcPr>
+            <w:tcW w:type="dxa" w:w="1080"/>
+            <w:shd w:fill="FFFFFF" w:val="clear"/>
+          </w:tcPr>
+          <w:p>
+            <w:r>
+              <w:rPr>
+                <w:rFonts w:ascii="Calibri" w:hAnsi="Calibri"/>
+                <w:sz w:val="20"/>
+              </w:rPr>
+              <w:t>6–10 нед</w:t>
+            </w:r>
+          </w:p>
+        </w:tc>
+        <w:tc>
+          <w:tcPr>
+            <w:tcW w:type="dxa" w:w="1224"/>
+            <w:shd w:fill="FFFFFF" w:val="clear"/>
+          </w:tcPr>
+          <w:p>
+            <w:r>
+              <w:rPr>
+                <w:rFonts w:ascii="Calibri" w:hAnsi="Calibri"/>
+                <w:sz w:val="20"/>
+              </w:rPr>
+              <w:t>$13 000</w:t>
+            </w:r>
+          </w:p>
+        </w:tc>
+        <w:tc>
+          <w:tcPr>
+            <w:tcW w:type="dxa" w:w="1224"/>
+            <w:shd w:fill="FFFFFF" w:val="clear"/>
+          </w:tcPr>
+          <w:p>
+            <w:r>
+              <w:rPr>
+                <w:rFonts w:ascii="Calibri" w:hAnsi="Calibri"/>
+                <w:sz w:val="20"/>
+              </w:rPr>
+              <w:t>$6 500</w:t>
+            </w:r>
+          </w:p>
+        </w:tc>
+        <w:tc>
+          <w:tcPr>
+            <w:tcW w:type="dxa" w:w="1368"/>
+            <w:shd w:fill="FFFFFF" w:val="clear"/>
+          </w:tcPr>
+          <w:p>
+            <w:r>
+              <w:rPr>
+                <w:rFonts w:ascii="Calibri" w:hAnsi="Calibri"/>
+                <w:sz w:val="20"/>
+              </w:rPr>
+              <w:t>$6 500</w:t>
+            </w:r>
+          </w:p>
+        </w:tc>
+      </w:tr>
+      <w:tr>
+        <w:tc>
+          <w:tcPr>
+            <w:tcW w:type="dxa" w:w="1584"/>
+            <w:shd w:fill="F8FAFC" w:val="clear"/>
+          </w:tcPr>
+          <w:p>
+            <w:r>
+              <w:rPr>
+                <w:rFonts w:ascii="Calibri" w:hAnsi="Calibri"/>
+                <w:sz w:val="20"/>
+              </w:rPr>
+              <w:t>2 · Видимость</w:t>
+            </w:r>
+          </w:p>
+        </w:tc>
+        <w:tc>
+          <w:tcPr>
+            <w:tcW w:type="dxa" w:w="1080"/>
+            <w:shd w:fill="F8FAFC" w:val="clear"/>
+          </w:tcPr>
+          <w:p>
+            <w:r>
+              <w:rPr>
+                <w:rFonts w:ascii="Calibri" w:hAnsi="Calibri"/>
+                <w:sz w:val="20"/>
+              </w:rPr>
+              <w:t>6–8 нед</w:t>
+            </w:r>
+          </w:p>
+        </w:tc>
+        <w:tc>
+          <w:tcPr>
+            <w:tcW w:type="dxa" w:w="1224"/>
+            <w:shd w:fill="F8FAFC" w:val="clear"/>
+          </w:tcPr>
+          <w:p>
+            <w:r>
+              <w:rPr>
+                <w:rFonts w:ascii="Calibri" w:hAnsi="Calibri"/>
+                <w:sz w:val="20"/>
+              </w:rPr>
+              <w:t>$10 000</w:t>
+            </w:r>
+          </w:p>
+        </w:tc>
+        <w:tc>
+          <w:tcPr>
+            <w:tcW w:type="dxa" w:w="1224"/>
+            <w:shd w:fill="F8FAFC" w:val="clear"/>
+          </w:tcPr>
+          <w:p>
+            <w:r>
+              <w:rPr>
+                <w:rFonts w:ascii="Calibri" w:hAnsi="Calibri"/>
+                <w:sz w:val="20"/>
+              </w:rPr>
+              <w:t>$5 000</w:t>
+            </w:r>
+          </w:p>
+        </w:tc>
+        <w:tc>
+          <w:tcPr>
+            <w:tcW w:type="dxa" w:w="1368"/>
+            <w:shd w:fill="F8FAFC" w:val="clear"/>
+          </w:tcPr>
+          <w:p>
+            <w:r>
+              <w:rPr>
+                <w:rFonts w:ascii="Calibri" w:hAnsi="Calibri"/>
+                <w:sz w:val="20"/>
+              </w:rPr>
+              <w:t>$5 000</w:t>
+            </w:r>
+          </w:p>
+        </w:tc>
+      </w:tr>
+      <w:tr>
+        <w:tc>
+          <w:tcPr>
+            <w:tcW w:type="dxa" w:w="1584"/>
+            <w:shd w:fill="FFFFFF" w:val="clear"/>
+          </w:tcPr>
+          <w:p>
+            <w:r>
+              <w:rPr>
+                <w:rFonts w:ascii="Calibri" w:hAnsi="Calibri"/>
+                <w:sz w:val="20"/>
+              </w:rPr>
+              <w:t>3 · Личный кабинет</w:t>
+            </w:r>
+          </w:p>
+        </w:tc>
+        <w:tc>
+          <w:tcPr>
+            <w:tcW w:type="dxa" w:w="1080"/>
+            <w:shd w:fill="FFFFFF" w:val="clear"/>
+          </w:tcPr>
+          <w:p>
+            <w:r>
+              <w:rPr>
+                <w:rFonts w:ascii="Calibri" w:hAnsi="Calibri"/>
+                <w:sz w:val="20"/>
+              </w:rPr>
+              <w:t>4–6 нед</w:t>
+            </w:r>
+          </w:p>
+        </w:tc>
+        <w:tc>
+          <w:tcPr>
+            <w:tcW w:type="dxa" w:w="1224"/>
+            <w:shd w:fill="FFFFFF" w:val="clear"/>
+          </w:tcPr>
+          <w:p>
+            <w:r>
+              <w:rPr>
+                <w:rFonts w:ascii="Calibri" w:hAnsi="Calibri"/>
+                <w:sz w:val="20"/>
+              </w:rPr>
+              <w:t>$9 000</w:t>
+            </w:r>
+          </w:p>
+        </w:tc>
+        <w:tc>
+          <w:tcPr>
+            <w:tcW w:type="dxa" w:w="1224"/>
+            <w:shd w:fill="FFFFFF" w:val="clear"/>
+          </w:tcPr>
+          <w:p>
+            <w:r>
+              <w:rPr>
+                <w:rFonts w:ascii="Calibri" w:hAnsi="Calibri"/>
+                <w:sz w:val="20"/>
+              </w:rPr>
+              <w:t>$4 500</w:t>
+            </w:r>
+          </w:p>
+        </w:tc>
+        <w:tc>
+          <w:tcPr>
+            <w:tcW w:type="dxa" w:w="1368"/>
+            <w:shd w:fill="FFFFFF" w:val="clear"/>
+          </w:tcPr>
+          <w:p>
+            <w:r>
+              <w:rPr>
+                <w:rFonts w:ascii="Calibri" w:hAnsi="Calibri"/>
+                <w:sz w:val="20"/>
+              </w:rPr>
+              <w:t>$4 500</w:t>
+            </w:r>
+          </w:p>
+        </w:tc>
+      </w:tr>
+      <w:tr>
+        <w:tc>
+          <w:tcPr>
+            <w:tcW w:type="dxa" w:w="1584"/>
+            <w:shd w:fill="F8FAFC" w:val="clear"/>
+          </w:tcPr>
+          <w:p>
+            <w:r>
+              <w:rPr>
+                <w:rFonts w:ascii="Calibri" w:hAnsi="Calibri"/>
+                <w:sz w:val="20"/>
+              </w:rPr>
+              <w:t>4 · Масштаб</w:t>
+            </w:r>
+          </w:p>
+        </w:tc>
+        <w:tc>
+          <w:tcPr>
+            <w:tcW w:type="dxa" w:w="1080"/>
+            <w:shd w:fill="F8FAFC" w:val="clear"/>
+          </w:tcPr>
+          <w:p>
+            <w:r>
+              <w:rPr>
+                <w:rFonts w:ascii="Calibri" w:hAnsi="Calibri"/>
+                <w:sz w:val="20"/>
+              </w:rPr>
+              <w:t>8–10 нед</w:t>
+            </w:r>
+          </w:p>
+        </w:tc>
+        <w:tc>
+          <w:tcPr>
+            <w:tcW w:type="dxa" w:w="1224"/>
+            <w:shd w:fill="F8FAFC" w:val="clear"/>
+          </w:tcPr>
+          <w:p>
+            <w:r>
+              <w:rPr>
+                <w:rFonts w:ascii="Calibri" w:hAnsi="Calibri"/>
+                <w:sz w:val="20"/>
+              </w:rPr>
+              <w:t>$11 000</w:t>
+            </w:r>
+          </w:p>
+        </w:tc>
+        <w:tc>
+          <w:tcPr>
+            <w:tcW w:type="dxa" w:w="1224"/>
+            <w:shd w:fill="F8FAFC" w:val="clear"/>
+          </w:tcPr>
+          <w:p>
+            <w:r>
+              <w:rPr>
+                <w:rFonts w:ascii="Calibri" w:hAnsi="Calibri"/>
+                <w:sz w:val="20"/>
+              </w:rPr>
+              <w:t>$5 500</w:t>
+            </w:r>
+          </w:p>
+        </w:tc>
+        <w:tc>
+          <w:tcPr>
+            <w:tcW w:type="dxa" w:w="1368"/>
+            <w:shd w:fill="F8FAFC" w:val="clear"/>
+          </w:tcPr>
+          <w:p>
+            <w:r>
+              <w:rPr>
+                <w:rFonts w:ascii="Calibri" w:hAnsi="Calibri"/>
+                <w:sz w:val="20"/>
+              </w:rPr>
+              <w:t>$5 500</w:t>
+            </w:r>
+          </w:p>
+        </w:tc>
+      </w:tr>
+      <w:tr>
+        <w:tc>
+          <w:tcPr>
+            <w:tcW w:type="dxa" w:w="1584"/>
+            <w:shd w:fill="FFFFFF" w:val="clear"/>
+          </w:tcPr>
+          <w:p>
+            <w:r>
+              <w:rPr>
+                <w:rFonts w:ascii="Calibri" w:hAnsi="Calibri"/>
+                <w:sz w:val="20"/>
+              </w:rPr>
+              <w:t>Итого программа</w:t>
+            </w:r>
+          </w:p>
+        </w:tc>
+        <w:tc>
+          <w:tcPr>
+            <w:tcW w:type="dxa" w:w="1080"/>
+            <w:shd w:fill="FFFFFF" w:val="clear"/>
+          </w:tcPr>
+          <w:p>
+            <w:r>
+              <w:rPr>
+                <w:rFonts w:ascii="Calibri" w:hAnsi="Calibri"/>
+                <w:sz w:val="20"/>
+              </w:rPr>
+              <w:t>~7–9 мес</w:t>
+            </w:r>
+          </w:p>
+        </w:tc>
+        <w:tc>
+          <w:tcPr>
+            <w:tcW w:type="dxa" w:w="1224"/>
+            <w:shd w:fill="FFFFFF" w:val="clear"/>
+          </w:tcPr>
+          <w:p>
+            <w:r>
+              <w:rPr>
+                <w:rFonts w:ascii="Calibri" w:hAnsi="Calibri"/>
+                <w:sz w:val="20"/>
+              </w:rPr>
+              <w:t>$43 000</w:t>
+            </w:r>
+          </w:p>
+        </w:tc>
+        <w:tc>
+          <w:tcPr>
+            <w:tcW w:type="dxa" w:w="1224"/>
+            <w:shd w:fill="FFFFFF" w:val="clear"/>
+          </w:tcPr>
+          <w:p>
+            <w:r>
+              <w:rPr>
+                <w:rFonts w:ascii="Calibri" w:hAnsi="Calibri"/>
+                <w:sz w:val="20"/>
+              </w:rPr>
+              <w:t>$21 500</w:t>
+            </w:r>
+          </w:p>
+        </w:tc>
+        <w:tc>
+          <w:tcPr>
+            <w:tcW w:type="dxa" w:w="1368"/>
+            <w:shd w:fill="FFFFFF" w:val="clear"/>
+          </w:tcPr>
+          <w:p>
+            <w:r>
+              <w:rPr>
+                <w:rFonts w:ascii="Calibri" w:hAnsi="Calibri"/>
+                <w:sz w:val="20"/>
+              </w:rPr>
+              <w:t>$21 500</w:t>
+            </w:r>
+          </w:p>
+        </w:tc>
+      </w:tr>
+    </w:tbl>
     <w:p>
       <w:pPr>
         <w:spacing w:after="200"/>
@@ -779,9 +1264,9 @@
           <w:rFonts w:ascii="Calibri" w:hAnsi="Calibri"/>
           <w:b w:val="0"/>
           <w:color w:val="334155"/>
-          <w:sz w:val="20"/>
+          <w:sz w:val="18"/>
         </w:rPr>
-        <w:t>Ориентир по программе: ~6 месяцев до рабочего контура; полный контур — до 8 месяцев.</w:t>
+        <w:t>Входной вариант: можно начать только с этапа 1 ($13 000). Этапы 2–4 — после приёмки предыдущего.</w:t>
       </w:r>
     </w:p>
     <w:p>
@@ -798,7 +1283,7 @@
     </w:p>
     <w:p>
       <w:pPr>
-        <w:spacing w:after="120"/>
+        <w:spacing w:after="80"/>
       </w:pPr>
       <w:r>
         <w:rPr>
@@ -806,7 +1291,27 @@
           <w:color w:val="B45309"/>
           <w:sz w:val="22"/>
         </w:rPr>
-        <w:t>Срок: 6–10 недель</w:t>
+        <w:t xml:space="preserve">Срок: 6–10 недель    </w:t>
+      </w:r>
+      <w:r>
+        <w:rPr>
+          <w:b/>
+          <w:color w:val="0F172A"/>
+          <w:sz w:val="22"/>
+        </w:rPr>
+        <w:t>Стоимость работ: $13 000</w:t>
+      </w:r>
+    </w:p>
+    <w:p>
+      <w:pPr>
+        <w:spacing w:after="120"/>
+      </w:pPr>
+      <w:r>
+        <w:rPr>
+          <w:color w:val="334155"/>
+          <w:sz w:val="20"/>
+        </w:rPr>
+        <w:t>Оплата: $6 500 — старт этапа  ·  $6 500 — после приёмки</w:t>
       </w:r>
     </w:p>
     <w:p>
@@ -1089,7 +1594,7 @@
     </w:p>
     <w:p>
       <w:pPr>
-        <w:spacing w:after="120"/>
+        <w:spacing w:after="80"/>
       </w:pPr>
       <w:r>
         <w:rPr>
@@ -1097,7 +1602,27 @@
           <w:color w:val="B45309"/>
           <w:sz w:val="22"/>
         </w:rPr>
-        <w:t>Срок: 6–8 недель</w:t>
+        <w:t xml:space="preserve">Срок: 6–8 недель    </w:t>
+      </w:r>
+      <w:r>
+        <w:rPr>
+          <w:b/>
+          <w:color w:val="0F172A"/>
+          <w:sz w:val="22"/>
+        </w:rPr>
+        <w:t>Стоимость работ: $10 000</w:t>
+      </w:r>
+    </w:p>
+    <w:p>
+      <w:pPr>
+        <w:spacing w:after="120"/>
+      </w:pPr>
+      <w:r>
+        <w:rPr>
+          <w:color w:val="334155"/>
+          <w:sz w:val="20"/>
+        </w:rPr>
+        <w:t>Оплата: $5 000 — старт этапа  ·  $5 000 — после приёмки</w:t>
       </w:r>
     </w:p>
     <w:p>
@@ -1304,7 +1829,7 @@
     </w:p>
     <w:p>
       <w:pPr>
-        <w:spacing w:after="120"/>
+        <w:spacing w:after="80"/>
       </w:pPr>
       <w:r>
         <w:rPr>
@@ -1312,7 +1837,27 @@
           <w:color w:val="B45309"/>
           <w:sz w:val="22"/>
         </w:rPr>
-        <w:t>Срок: 4–6 недель</w:t>
+        <w:t xml:space="preserve">Срок: 4–6 недель    </w:t>
+      </w:r>
+      <w:r>
+        <w:rPr>
+          <w:b/>
+          <w:color w:val="0F172A"/>
+          <w:sz w:val="22"/>
+        </w:rPr>
+        <w:t>Стоимость работ: $9 000</w:t>
+      </w:r>
+    </w:p>
+    <w:p>
+      <w:pPr>
+        <w:spacing w:after="120"/>
+      </w:pPr>
+      <w:r>
+        <w:rPr>
+          <w:color w:val="334155"/>
+          <w:sz w:val="20"/>
+        </w:rPr>
+        <w:t>Оплата: $4 500 — старт этапа  ·  $4 500 — после приёмки</w:t>
       </w:r>
     </w:p>
     <w:p>
@@ -1532,7 +2077,7 @@
     </w:p>
     <w:p>
       <w:pPr>
-        <w:spacing w:after="120"/>
+        <w:spacing w:after="80"/>
       </w:pPr>
       <w:r>
         <w:rPr>
@@ -1540,7 +2085,27 @@
           <w:color w:val="B45309"/>
           <w:sz w:val="22"/>
         </w:rPr>
-        <w:t>Срок: 8–10 недель</w:t>
+        <w:t xml:space="preserve">Срок: 8–10 недель    </w:t>
+      </w:r>
+      <w:r>
+        <w:rPr>
+          <w:b/>
+          <w:color w:val="0F172A"/>
+          <w:sz w:val="22"/>
+        </w:rPr>
+        <w:t>Стоимость работ: $11 000</w:t>
+      </w:r>
+    </w:p>
+    <w:p>
+      <w:pPr>
+        <w:spacing w:after="120"/>
+      </w:pPr>
+      <w:r>
+        <w:rPr>
+          <w:color w:val="334155"/>
+          <w:sz w:val="20"/>
+        </w:rPr>
+        <w:t>Оплата: $5 500 — старт этапа  ·  $5 500 — после приёмки</w:t>
       </w:r>
     </w:p>
     <w:p>
@@ -1907,7 +2472,7 @@
           <w:rFonts w:ascii="Calibri" w:hAnsi="Calibri"/>
           <w:color w:val="0F172A"/>
         </w:rPr>
-        <w:t>6. Расходы GRC на инфраструктуру</w:t>
+        <w:t>6. Расходы GRC на инфраструктуру (не входят в $43 000)</w:t>
       </w:r>
     </w:p>
     <w:p>
@@ -1921,7 +2486,7 @@
           <w:color w:val="334155"/>
           <w:sz w:val="20"/>
         </w:rPr>
-        <w:t>Оплачиваются напрямую GRC со своих аккаунтов — отдельно от работ исполнителя.</w:t>
+        <w:t>Это подписки и сервисы на аккаунтах GRC — Twilio, CRM, хостинг, AI API и т.д. Оплачиваются напрямую GRC. Не путать со стоимостью работ исполнителя в §3.</w:t>
       </w:r>
     </w:p>
     <w:p>

</xml_diff>